<commit_message>
Added calculation for plate thickness to Plate material properties.
</commit_message>
<xml_diff>
--- a/GuitarTap/Trevor Gore Thickness.docx
+++ b/GuitarTap/Trevor Gore Thickness.docx
@@ -289,7 +289,7 @@
           <w14:ligatures w14:val="none"/>
         </w:rPr>
         <w:drawing>
-          <wp:inline distT="0" distB="0" distL="0" distR="0" wp14:anchorId="4302DBEF" wp14:editId="2B330872">
+          <wp:inline distT="0" distB="0" distL="0" distR="0" wp14:anchorId="4302DBEF" wp14:editId="4F5BDD93">
             <wp:extent cx="152400" cy="152400"/>
             <wp:effectExtent l="0" t="0" r="0" b="0"/>
             <wp:docPr id="178303269" name="Picture 26" descr="favicon"/>
@@ -405,7 +405,7 @@
           <w14:ligatures w14:val="none"/>
         </w:rPr>
         <w:drawing>
-          <wp:inline distT="0" distB="0" distL="0" distR="0" wp14:anchorId="5FBC3D2F" wp14:editId="0785985E">
+          <wp:inline distT="0" distB="0" distL="0" distR="0" wp14:anchorId="5FBC3D2F" wp14:editId="31E59397">
             <wp:extent cx="152400" cy="152400"/>
             <wp:effectExtent l="0" t="0" r="0" b="0"/>
             <wp:docPr id="132169052" name="Picture 25" descr="favicon"/>
@@ -521,7 +521,7 @@
           <w14:ligatures w14:val="none"/>
         </w:rPr>
         <w:drawing>
-          <wp:inline distT="0" distB="0" distL="0" distR="0" wp14:anchorId="53841A5A" wp14:editId="6A923EF1">
+          <wp:inline distT="0" distB="0" distL="0" distR="0" wp14:anchorId="53841A5A" wp14:editId="625D5728">
             <wp:extent cx="152400" cy="152400"/>
             <wp:effectExtent l="0" t="0" r="0" b="0"/>
             <wp:docPr id="1588713910" name="Picture 24" descr="favicon"/>
@@ -637,7 +637,7 @@
           <w14:ligatures w14:val="none"/>
         </w:rPr>
         <w:drawing>
-          <wp:inline distT="0" distB="0" distL="0" distR="0" wp14:anchorId="0DF3C637" wp14:editId="78A199B2">
+          <wp:inline distT="0" distB="0" distL="0" distR="0" wp14:anchorId="0DF3C637" wp14:editId="2CB622AF">
             <wp:extent cx="152400" cy="152400"/>
             <wp:effectExtent l="0" t="0" r="0" b="0"/>
             <wp:docPr id="596495970" name="Picture 23" descr="favicon"/>
@@ -753,7 +753,7 @@
           <w14:ligatures w14:val="none"/>
         </w:rPr>
         <w:drawing>
-          <wp:inline distT="0" distB="0" distL="0" distR="0" wp14:anchorId="5C07E573" wp14:editId="0AD06AE5">
+          <wp:inline distT="0" distB="0" distL="0" distR="0" wp14:anchorId="5C07E573" wp14:editId="45F03F38">
             <wp:extent cx="152400" cy="152400"/>
             <wp:effectExtent l="0" t="0" r="0" b="0"/>
             <wp:docPr id="2053453832" name="Picture 22" descr="favicon"/>
@@ -869,7 +869,7 @@
           <w14:ligatures w14:val="none"/>
         </w:rPr>
         <w:drawing>
-          <wp:inline distT="0" distB="0" distL="0" distR="0" wp14:anchorId="35FA52D5" wp14:editId="5A47AD4E">
+          <wp:inline distT="0" distB="0" distL="0" distR="0" wp14:anchorId="35FA52D5" wp14:editId="1F882B42">
             <wp:extent cx="152400" cy="152400"/>
             <wp:effectExtent l="0" t="0" r="0" b="0"/>
             <wp:docPr id="1117209591" name="Picture 21" descr="favicon"/>
@@ -1449,7 +1449,7 @@
           <w14:ligatures w14:val="none"/>
         </w:rPr>
         <w:drawing>
-          <wp:inline distT="0" distB="0" distL="0" distR="0" wp14:anchorId="586ED6E6" wp14:editId="5B2CA1CA">
+          <wp:inline distT="0" distB="0" distL="0" distR="0" wp14:anchorId="586ED6E6" wp14:editId="367E1F6B">
             <wp:extent cx="152400" cy="152400"/>
             <wp:effectExtent l="0" t="0" r="0" b="0"/>
             <wp:docPr id="960332565" name="Picture 16" descr="favicon"/>
@@ -1565,7 +1565,7 @@
           <w14:ligatures w14:val="none"/>
         </w:rPr>
         <w:drawing>
-          <wp:inline distT="0" distB="0" distL="0" distR="0" wp14:anchorId="2F3710BE" wp14:editId="7AA65C37">
+          <wp:inline distT="0" distB="0" distL="0" distR="0" wp14:anchorId="2F3710BE" wp14:editId="52879579">
             <wp:extent cx="152400" cy="152400"/>
             <wp:effectExtent l="0" t="0" r="0" b="0"/>
             <wp:docPr id="662216329" name="Picture 15" descr="favicon"/>
@@ -1681,7 +1681,7 @@
           <w14:ligatures w14:val="none"/>
         </w:rPr>
         <w:drawing>
-          <wp:inline distT="0" distB="0" distL="0" distR="0" wp14:anchorId="6E8A2508" wp14:editId="243AB109">
+          <wp:inline distT="0" distB="0" distL="0" distR="0" wp14:anchorId="6E8A2508" wp14:editId="4369F277">
             <wp:extent cx="152400" cy="152400"/>
             <wp:effectExtent l="0" t="0" r="0" b="0"/>
             <wp:docPr id="884672323" name="Picture 14" descr="favicon"/>
@@ -1913,7 +1913,7 @@
           <w14:ligatures w14:val="none"/>
         </w:rPr>
         <w:drawing>
-          <wp:inline distT="0" distB="0" distL="0" distR="0" wp14:anchorId="6DE4144C" wp14:editId="61F8E374">
+          <wp:inline distT="0" distB="0" distL="0" distR="0" wp14:anchorId="6DE4144C" wp14:editId="64F91A11">
             <wp:extent cx="152400" cy="152400"/>
             <wp:effectExtent l="0" t="0" r="0" b="0"/>
             <wp:docPr id="1118957973" name="Picture 12" descr="favicon"/>
@@ -2261,7 +2261,7 @@
           <w14:ligatures w14:val="none"/>
         </w:rPr>
         <w:drawing>
-          <wp:inline distT="0" distB="0" distL="0" distR="0" wp14:anchorId="2AF06C18" wp14:editId="64C7D9BC">
+          <wp:inline distT="0" distB="0" distL="0" distR="0" wp14:anchorId="2AF06C18" wp14:editId="693658CA">
             <wp:extent cx="152400" cy="152400"/>
             <wp:effectExtent l="0" t="0" r="0" b="0"/>
             <wp:docPr id="799808835" name="Picture 9" descr="favicon"/>
@@ -2377,7 +2377,7 @@
           <w14:ligatures w14:val="none"/>
         </w:rPr>
         <w:drawing>
-          <wp:inline distT="0" distB="0" distL="0" distR="0" wp14:anchorId="646F9BAD" wp14:editId="5E2FA488">
+          <wp:inline distT="0" distB="0" distL="0" distR="0" wp14:anchorId="646F9BAD" wp14:editId="2DF69EC9">
             <wp:extent cx="152400" cy="152400"/>
             <wp:effectExtent l="0" t="0" r="0" b="0"/>
             <wp:docPr id="812560983" name="Picture 8" descr="favicon"/>
@@ -2493,7 +2493,7 @@
           <w14:ligatures w14:val="none"/>
         </w:rPr>
         <w:drawing>
-          <wp:inline distT="0" distB="0" distL="0" distR="0" wp14:anchorId="28B41637" wp14:editId="05A320D8">
+          <wp:inline distT="0" distB="0" distL="0" distR="0" wp14:anchorId="28B41637" wp14:editId="5006BFBD">
             <wp:extent cx="152400" cy="152400"/>
             <wp:effectExtent l="0" t="0" r="0" b="0"/>
             <wp:docPr id="1070616226" name="Picture 7" descr="favicon"/>
@@ -2609,7 +2609,7 @@
           <w14:ligatures w14:val="none"/>
         </w:rPr>
         <w:drawing>
-          <wp:inline distT="0" distB="0" distL="0" distR="0" wp14:anchorId="1FC4F1B5" wp14:editId="06A511A8">
+          <wp:inline distT="0" distB="0" distL="0" distR="0" wp14:anchorId="1FC4F1B5" wp14:editId="6AE4365F">
             <wp:extent cx="152400" cy="152400"/>
             <wp:effectExtent l="0" t="0" r="0" b="0"/>
             <wp:docPr id="332961962" name="Picture 6" descr="favicon"/>
@@ -2725,7 +2725,7 @@
           <w14:ligatures w14:val="none"/>
         </w:rPr>
         <w:drawing>
-          <wp:inline distT="0" distB="0" distL="0" distR="0" wp14:anchorId="6179694B" wp14:editId="47CC60A9">
+          <wp:inline distT="0" distB="0" distL="0" distR="0" wp14:anchorId="6179694B" wp14:editId="761DA8DE">
             <wp:extent cx="152400" cy="152400"/>
             <wp:effectExtent l="0" t="0" r="0" b="0"/>
             <wp:docPr id="1271941128" name="Picture 5" descr="favicon"/>
@@ -2841,7 +2841,7 @@
           <w14:ligatures w14:val="none"/>
         </w:rPr>
         <w:drawing>
-          <wp:inline distT="0" distB="0" distL="0" distR="0" wp14:anchorId="09C95976" wp14:editId="52C76DCE">
+          <wp:inline distT="0" distB="0" distL="0" distR="0" wp14:anchorId="09C95976" wp14:editId="7B8D485A">
             <wp:extent cx="152400" cy="152400"/>
             <wp:effectExtent l="0" t="0" r="0" b="0"/>
             <wp:docPr id="1995055588" name="Picture 4" descr="favicon"/>
@@ -2957,7 +2957,7 @@
           <w14:ligatures w14:val="none"/>
         </w:rPr>
         <w:drawing>
-          <wp:inline distT="0" distB="0" distL="0" distR="0" wp14:anchorId="0C79B6F9" wp14:editId="7A02A6D7">
+          <wp:inline distT="0" distB="0" distL="0" distR="0" wp14:anchorId="0C79B6F9" wp14:editId="68E02F8E">
             <wp:extent cx="152400" cy="152400"/>
             <wp:effectExtent l="0" t="0" r="0" b="0"/>
             <wp:docPr id="1975836576" name="Picture 3" descr="favicon"/>
@@ -3073,7 +3073,7 @@
           <w14:ligatures w14:val="none"/>
         </w:rPr>
         <w:drawing>
-          <wp:inline distT="0" distB="0" distL="0" distR="0" wp14:anchorId="346D1D4A" wp14:editId="2260E374">
+          <wp:inline distT="0" distB="0" distL="0" distR="0" wp14:anchorId="346D1D4A" wp14:editId="1986F135">
             <wp:extent cx="152400" cy="152400"/>
             <wp:effectExtent l="0" t="0" r="0" b="0"/>
             <wp:docPr id="1982970543" name="Picture 2" descr="favicon"/>
@@ -3189,7 +3189,7 @@
           <w14:ligatures w14:val="none"/>
         </w:rPr>
         <w:drawing>
-          <wp:inline distT="0" distB="0" distL="0" distR="0" wp14:anchorId="59096783" wp14:editId="7EDDE9D7">
+          <wp:inline distT="0" distB="0" distL="0" distR="0" wp14:anchorId="59096783" wp14:editId="1DDBEFB0">
             <wp:extent cx="152400" cy="152400"/>
             <wp:effectExtent l="0" t="0" r="0" b="0"/>
             <wp:docPr id="568558317" name="Picture 1" descr="favicon"/>
@@ -3326,7 +3326,7 @@
           <w:szCs w:val="27"/>
         </w:rPr>
         <w:lastRenderedPageBreak/>
-        <w:pict w14:anchorId="2E7EF951">
+        <w:pict w14:anchorId="45994CCD">
           <v:rect id="_x0000_i1042" alt="" style="width:468pt;height:.05pt;mso-width-percent:0;mso-height-percent:0;mso-width-percent:0;mso-height-percent:0" o:hralign="center" o:hrstd="t" o:hr="t" fillcolor="#a0a0a0" stroked="f"/>
         </w:pict>
       </w:r>
@@ -3417,7 +3417,7 @@
           <w:sz w:val="27"/>
           <w:szCs w:val="27"/>
         </w:rPr>
-        <w:pict w14:anchorId="73949E81">
+        <w:pict w14:anchorId="7809B53E">
           <v:rect id="_x0000_i1041" alt="" style="width:468pt;height:.05pt;mso-width-percent:0;mso-height-percent:0;mso-width-percent:0;mso-height-percent:0" o:hralign="center" o:hrstd="t" o:hr="t" fillcolor="#a0a0a0" stroked="f"/>
         </w:pict>
       </w:r>
@@ -3782,7 +3782,7 @@
           <w:sz w:val="27"/>
           <w:szCs w:val="27"/>
         </w:rPr>
-        <w:pict w14:anchorId="2418F52B">
+        <w:pict w14:anchorId="62036FFE">
           <v:rect id="_x0000_i1040" alt="" style="width:468pt;height:.05pt;mso-width-percent:0;mso-height-percent:0;mso-width-percent:0;mso-height-percent:0" o:hralign="center" o:hrstd="t" o:hr="t" fillcolor="#a0a0a0" stroked="f"/>
         </w:pict>
       </w:r>
@@ -4143,6 +4143,9 @@
             </m:den>
           </m:f>
           <m:r>
+            <m:rPr>
+              <m:sty m:val="p"/>
+            </m:rPr>
             <w:rPr>
               <w:rFonts w:ascii="Cambria Math" w:eastAsia="Times New Roman" w:hAnsi="Cambria Math" w:cs="Times New Roman"/>
               <w:kern w:val="0"/>
@@ -4410,6 +4413,9 @@
             </m:den>
           </m:f>
           <m:r>
+            <m:rPr>
+              <m:sty m:val="p"/>
+            </m:rPr>
             <w:rPr>
               <w:rFonts w:ascii="Cambria Math" w:eastAsia="Times New Roman" w:hAnsi="Cambria Math" w:cs="Times New Roman"/>
               <w:kern w:val="0"/>
@@ -4807,6 +4813,9 @@
             </m:den>
           </m:f>
           <m:r>
+            <m:rPr>
+              <m:sty m:val="p"/>
+            </m:rPr>
             <w:rPr>
               <w:rFonts w:ascii="Cambria Math" w:eastAsia="Times New Roman" w:hAnsi="Cambria Math" w:cs="Times New Roman"/>
               <w:kern w:val="0"/>
@@ -4838,7 +4847,7 @@
           <w:sz w:val="27"/>
           <w:szCs w:val="27"/>
         </w:rPr>
-        <w:pict w14:anchorId="54452260">
+        <w:pict w14:anchorId="78582FE6">
           <v:rect id="_x0000_i1039" alt="" style="width:468pt;height:.05pt;mso-width-percent:0;mso-height-percent:0;mso-width-percent:0;mso-height-percent:0" o:hralign="center" o:hrstd="t" o:hr="t" fillcolor="#a0a0a0" stroked="f"/>
         </w:pict>
       </w:r>
@@ -5333,6 +5342,9 @@
             </m:den>
           </m:f>
           <m:r>
+            <m:rPr>
+              <m:sty m:val="p"/>
+            </m:rPr>
             <w:rPr>
               <w:rFonts w:ascii="Cambria Math" w:eastAsia="Times New Roman" w:hAnsi="Cambria Math" w:cs="Times New Roman"/>
               <w:kern w:val="0"/>
@@ -5753,7 +5765,7 @@
           <w:sz w:val="27"/>
           <w:szCs w:val="27"/>
         </w:rPr>
-        <w:pict w14:anchorId="1778E271">
+        <w:pict w14:anchorId="28C86C41">
           <v:rect id="_x0000_i1038" alt="" style="width:468pt;height:.05pt;mso-width-percent:0;mso-height-percent:0;mso-width-percent:0;mso-height-percent:0" o:hralign="center" o:hrstd="t" o:hr="t" fillcolor="#a0a0a0" stroked="f"/>
         </w:pict>
       </w:r>
@@ -5881,7 +5893,6 @@
           <m:r>
             <w:rPr>
               <w:rFonts w:ascii="Cambria Math" w:eastAsia="Times New Roman" w:hAnsi="Cambria Math" w:cs="Times New Roman"/>
-              <w:i/>
               <w:kern w:val="0"/>
               <w14:ligatures w14:val="none"/>
             </w:rPr>
@@ -6080,6 +6091,9 @@
             </m:den>
           </m:f>
           <m:r>
+            <m:rPr>
+              <m:sty m:val="p"/>
+            </m:rPr>
             <w:rPr>
               <w:rFonts w:ascii="Cambria Math" w:eastAsia="Times New Roman" w:hAnsi="Cambria Math" w:cs="Times New Roman"/>
               <w:kern w:val="0"/>
@@ -6344,6 +6358,9 @@
             </m:den>
           </m:f>
           <m:r>
+            <m:rPr>
+              <m:sty m:val="p"/>
+            </m:rPr>
             <w:rPr>
               <w:rFonts w:ascii="Cambria Math" w:eastAsia="Times New Roman" w:hAnsi="Cambria Math" w:cs="Times New Roman"/>
               <w:kern w:val="0"/>
@@ -6430,7 +6447,7 @@
           <w:sz w:val="27"/>
           <w:szCs w:val="27"/>
         </w:rPr>
-        <w:pict w14:anchorId="038EB576">
+        <w:pict w14:anchorId="59214F68">
           <v:rect id="_x0000_i1037" alt="" style="width:468pt;height:.05pt;mso-width-percent:0;mso-height-percent:0;mso-width-percent:0;mso-height-percent:0" o:hralign="center" o:hrstd="t" o:hr="t" fillcolor="#a0a0a0" stroked="f"/>
         </w:pict>
       </w:r>
@@ -7034,7 +7051,7 @@
           <w:sz w:val="27"/>
           <w:szCs w:val="27"/>
         </w:rPr>
-        <w:pict w14:anchorId="1EBBA53C">
+        <w:pict w14:anchorId="61DE6B8D">
           <v:rect id="_x0000_i1036" alt="" style="width:468pt;height:.05pt;mso-width-percent:0;mso-height-percent:0;mso-width-percent:0;mso-height-percent:0" o:hralign="center" o:hrstd="t" o:hr="t" fillcolor="#a0a0a0" stroked="f"/>
         </w:pict>
       </w:r>
@@ -7391,7 +7408,7 @@
           <w:sz w:val="27"/>
           <w:szCs w:val="27"/>
         </w:rPr>
-        <w:pict w14:anchorId="59ACBEF1">
+        <w:pict w14:anchorId="2B4777BB">
           <v:rect id="_x0000_i1035" alt="" style="width:468pt;height:.05pt;mso-width-percent:0;mso-height-percent:0;mso-width-percent:0;mso-height-percent:0" o:hralign="center" o:hrstd="t" o:hr="t" fillcolor="#a0a0a0" stroked="f"/>
         </w:pict>
       </w:r>
@@ -7600,6 +7617,9 @@
             </m:den>
           </m:f>
           <m:r>
+            <m:rPr>
+              <m:sty m:val="p"/>
+            </m:rPr>
             <w:rPr>
               <w:rFonts w:ascii="Cambria Math" w:eastAsia="Times New Roman" w:hAnsi="Cambria Math" w:cs="Times New Roman"/>
               <w:kern w:val="0"/>
@@ -7938,7 +7958,7 @@
           <w:sz w:val="27"/>
           <w:szCs w:val="27"/>
         </w:rPr>
-        <w:pict w14:anchorId="1092A46F">
+        <w:pict w14:anchorId="09286BB8">
           <v:rect id="_x0000_i1034" alt="" style="width:468pt;height:.05pt;mso-width-percent:0;mso-height-percent:0;mso-width-percent:0;mso-height-percent:0" o:hralign="center" o:hrstd="t" o:hr="t" fillcolor="#a0a0a0" stroked="f"/>
         </w:pict>
       </w:r>
@@ -8116,7 +8136,7 @@
           <w:sz w:val="27"/>
           <w:szCs w:val="27"/>
         </w:rPr>
-        <w:pict w14:anchorId="38AB7AC7">
+        <w:pict w14:anchorId="68914811">
           <v:rect id="_x0000_i1033" alt="" style="width:468pt;height:.05pt;mso-width-percent:0;mso-height-percent:0;mso-width-percent:0;mso-height-percent:0" o:hralign="center" o:hrstd="t" o:hr="t" fillcolor="#a0a0a0" stroked="f"/>
         </w:pict>
       </w:r>
@@ -8232,7 +8252,7 @@
           <w:sz w:val="27"/>
           <w:szCs w:val="27"/>
         </w:rPr>
-        <w:pict w14:anchorId="183940D2">
+        <w:pict w14:anchorId="3206B872">
           <v:rect id="_x0000_i1032" alt="" style="width:468pt;height:.05pt;mso-width-percent:0;mso-height-percent:0;mso-width-percent:0;mso-height-percent:0" o:hralign="center" o:hrstd="t" o:hr="t" fillcolor="#a0a0a0" stroked="f"/>
         </w:pict>
       </w:r>
@@ -8622,7 +8642,7 @@
           <w:sz w:val="27"/>
           <w:szCs w:val="27"/>
         </w:rPr>
-        <w:pict w14:anchorId="03F97C26">
+        <w:pict w14:anchorId="6C67458E">
           <v:rect id="_x0000_i1031" alt="" style="width:468pt;height:.05pt;mso-width-percent:0;mso-height-percent:0;mso-width-percent:0;mso-height-percent:0" o:hralign="center" o:hrstd="t" o:hr="t" fillcolor="#a0a0a0" stroked="f"/>
         </w:pict>
       </w:r>
@@ -9211,7 +9231,7 @@
           <w:sz w:val="27"/>
           <w:szCs w:val="27"/>
         </w:rPr>
-        <w:pict w14:anchorId="000BBBD6">
+        <w:pict w14:anchorId="697AFD7B">
           <v:rect id="_x0000_i1030" alt="" style="width:468pt;height:.05pt;mso-width-percent:0;mso-height-percent:0;mso-width-percent:0;mso-height-percent:0" o:hralign="center" o:hrstd="t" o:hr="t" fillcolor="#a0a0a0" stroked="f"/>
         </w:pict>
       </w:r>
@@ -9333,7 +9353,7 @@
           <w:sz w:val="27"/>
           <w:szCs w:val="27"/>
         </w:rPr>
-        <w:pict w14:anchorId="7F615AE2">
+        <w:pict w14:anchorId="67AEE541">
           <v:rect id="_x0000_i1029" alt="" style="width:468pt;height:.05pt;mso-width-percent:0;mso-height-percent:0;mso-width-percent:0;mso-height-percent:0" o:hralign="center" o:hrstd="t" o:hr="t" fillcolor="#a0a0a0" stroked="f"/>
         </w:pict>
       </w:r>
@@ -9580,6 +9600,9 @@
             </m:den>
           </m:f>
           <m:r>
+            <m:rPr>
+              <m:sty m:val="p"/>
+            </m:rPr>
             <w:rPr>
               <w:rFonts w:ascii="Cambria Math" w:eastAsia="Times New Roman" w:hAnsi="Cambria Math" w:cs="Times New Roman"/>
               <w:kern w:val="0"/>
@@ -9727,7 +9750,7 @@
           <w:sz w:val="27"/>
           <w:szCs w:val="27"/>
         </w:rPr>
-        <w:pict w14:anchorId="3AF76730">
+        <w:pict w14:anchorId="2C441B7F">
           <v:rect id="_x0000_i1028" alt="" style="width:468pt;height:.05pt;mso-width-percent:0;mso-height-percent:0;mso-width-percent:0;mso-height-percent:0" o:hralign="center" o:hrstd="t" o:hr="t" fillcolor="#a0a0a0" stroked="f"/>
         </w:pict>
       </w:r>
@@ -9873,7 +9896,7 @@
           <w:sz w:val="27"/>
           <w:szCs w:val="27"/>
         </w:rPr>
-        <w:pict w14:anchorId="76C14029">
+        <w:pict w14:anchorId="21923BEF">
           <v:rect id="_x0000_i1027" alt="" style="width:468pt;height:.05pt;mso-width-percent:0;mso-height-percent:0;mso-width-percent:0;mso-height-percent:0" o:hralign="center" o:hrstd="t" o:hr="t" fillcolor="#a0a0a0" stroked="f"/>
         </w:pict>
       </w:r>
@@ -10107,6 +10130,9 @@
             </m:den>
           </m:f>
           <m:r>
+            <m:rPr>
+              <m:sty m:val="p"/>
+            </m:rPr>
             <w:rPr>
               <w:rFonts w:ascii="Cambria Math" w:eastAsia="Times New Roman" w:hAnsi="Cambria Math" w:cs="Times New Roman"/>
               <w:kern w:val="0"/>
@@ -10385,7 +10411,7 @@
           <w:sz w:val="27"/>
           <w:szCs w:val="27"/>
         </w:rPr>
-        <w:pict w14:anchorId="78686A6A">
+        <w:pict w14:anchorId="04F053F1">
           <v:rect id="_x0000_i1026" alt="" style="width:468pt;height:.05pt;mso-width-percent:0;mso-height-percent:0;mso-width-percent:0;mso-height-percent:0" o:hralign="center" o:hrstd="t" o:hr="t" fillcolor="#a0a0a0" stroked="f"/>
         </w:pict>
       </w:r>
@@ -10760,7 +10786,7 @@
           <w:sz w:val="27"/>
           <w:szCs w:val="27"/>
         </w:rPr>
-        <w:pict w14:anchorId="7385EAC1">
+        <w:pict w14:anchorId="53D5F95D">
           <v:rect id="_x0000_i1025" alt="" style="width:468pt;height:.05pt;mso-width-percent:0;mso-height-percent:0;mso-width-percent:0;mso-height-percent:0" o:hralign="center" o:hrstd="t" o:hr="t" fillcolor="#a0a0a0" stroked="f"/>
         </w:pict>
       </w:r>
@@ -11303,6 +11329,1266 @@
       </w:pPr>
     </w:p>
     <w:p/>
+    <w:p/>
+    <w:p>
+      <w:pPr>
+        <w:tabs>
+          <w:tab w:val="left" w:pos="560"/>
+          <w:tab w:val="left" w:pos="1120"/>
+          <w:tab w:val="left" w:pos="1680"/>
+          <w:tab w:val="left" w:pos="2240"/>
+          <w:tab w:val="left" w:pos="2800"/>
+          <w:tab w:val="left" w:pos="3360"/>
+          <w:tab w:val="left" w:pos="3920"/>
+          <w:tab w:val="left" w:pos="4480"/>
+          <w:tab w:val="left" w:pos="5040"/>
+          <w:tab w:val="left" w:pos="5600"/>
+          <w:tab w:val="left" w:pos="6160"/>
+          <w:tab w:val="left" w:pos="6720"/>
+        </w:tabs>
+        <w:autoSpaceDE w:val="0"/>
+        <w:autoSpaceDN w:val="0"/>
+        <w:adjustRightInd w:val="0"/>
+        <w:spacing w:after="0" w:line="240" w:lineRule="auto"/>
+        <w:rPr>
+          <w:rFonts w:ascii="Helvetica Neue" w:hAnsi="Helvetica Neue" w:cs="Helvetica Neue"/>
+          <w:color w:val="000000"/>
+          <w:kern w:val="0"/>
+          <w:sz w:val="26"/>
+          <w:szCs w:val="26"/>
+        </w:rPr>
+      </w:pPr>
+      <w:r>
+        <w:rPr>
+          <w:rFonts w:ascii="Helvetica Neue" w:hAnsi="Helvetica Neue" w:cs="Helvetica Neue"/>
+          <w:color w:val="000000"/>
+          <w:kern w:val="0"/>
+          <w:sz w:val="26"/>
+          <w:szCs w:val="26"/>
+        </w:rPr>
+        <w:t>All four coefficients and the complete calculation match the spreadsheet exactly. Here's a summary of everything implemented:</w:t>
+      </w:r>
+    </w:p>
+    <w:p>
+      <w:pPr>
+        <w:tabs>
+          <w:tab w:val="left" w:pos="560"/>
+          <w:tab w:val="left" w:pos="1120"/>
+          <w:tab w:val="left" w:pos="1680"/>
+          <w:tab w:val="left" w:pos="2240"/>
+          <w:tab w:val="left" w:pos="2800"/>
+          <w:tab w:val="left" w:pos="3360"/>
+          <w:tab w:val="left" w:pos="3920"/>
+          <w:tab w:val="left" w:pos="4480"/>
+          <w:tab w:val="left" w:pos="5040"/>
+          <w:tab w:val="left" w:pos="5600"/>
+          <w:tab w:val="left" w:pos="6160"/>
+          <w:tab w:val="left" w:pos="6720"/>
+        </w:tabs>
+        <w:autoSpaceDE w:val="0"/>
+        <w:autoSpaceDN w:val="0"/>
+        <w:adjustRightInd w:val="0"/>
+        <w:spacing w:after="0" w:line="240" w:lineRule="auto"/>
+        <w:rPr>
+          <w:rFonts w:ascii="Helvetica Neue" w:hAnsi="Helvetica Neue" w:cs="Helvetica Neue"/>
+          <w:color w:val="000000"/>
+          <w:kern w:val="0"/>
+          <w:sz w:val="26"/>
+          <w:szCs w:val="26"/>
+        </w:rPr>
+      </w:pPr>
+    </w:p>
+    <w:p>
+      <w:pPr>
+        <w:tabs>
+          <w:tab w:val="left" w:pos="560"/>
+          <w:tab w:val="left" w:pos="1120"/>
+          <w:tab w:val="left" w:pos="1680"/>
+          <w:tab w:val="left" w:pos="2240"/>
+          <w:tab w:val="left" w:pos="2800"/>
+          <w:tab w:val="left" w:pos="3360"/>
+          <w:tab w:val="left" w:pos="3920"/>
+          <w:tab w:val="left" w:pos="4480"/>
+          <w:tab w:val="left" w:pos="5040"/>
+          <w:tab w:val="left" w:pos="5600"/>
+          <w:tab w:val="left" w:pos="6160"/>
+          <w:tab w:val="left" w:pos="6720"/>
+        </w:tabs>
+        <w:autoSpaceDE w:val="0"/>
+        <w:autoSpaceDN w:val="0"/>
+        <w:adjustRightInd w:val="0"/>
+        <w:spacing w:after="0" w:line="240" w:lineRule="auto"/>
+        <w:rPr>
+          <w:rFonts w:ascii="Helvetica Neue" w:hAnsi="Helvetica Neue" w:cs="Helvetica Neue"/>
+          <w:color w:val="000000"/>
+          <w:kern w:val="0"/>
+          <w:sz w:val="26"/>
+          <w:szCs w:val="26"/>
+        </w:rPr>
+      </w:pPr>
+      <w:r>
+        <w:rPr>
+          <w:rFonts w:ascii="Segoe UI" w:hAnsi="Segoe UI" w:cs="Segoe UI"/>
+          <w:color w:val="000000"/>
+          <w:kern w:val="0"/>
+          <w:sz w:val="26"/>
+          <w:szCs w:val="26"/>
+        </w:rPr>
+        <w:t>⸻</w:t>
+      </w:r>
+    </w:p>
+    <w:p>
+      <w:pPr>
+        <w:tabs>
+          <w:tab w:val="left" w:pos="560"/>
+          <w:tab w:val="left" w:pos="1120"/>
+          <w:tab w:val="left" w:pos="1680"/>
+          <w:tab w:val="left" w:pos="2240"/>
+          <w:tab w:val="left" w:pos="2800"/>
+          <w:tab w:val="left" w:pos="3360"/>
+          <w:tab w:val="left" w:pos="3920"/>
+          <w:tab w:val="left" w:pos="4480"/>
+          <w:tab w:val="left" w:pos="5040"/>
+          <w:tab w:val="left" w:pos="5600"/>
+          <w:tab w:val="left" w:pos="6160"/>
+          <w:tab w:val="left" w:pos="6720"/>
+        </w:tabs>
+        <w:autoSpaceDE w:val="0"/>
+        <w:autoSpaceDN w:val="0"/>
+        <w:adjustRightInd w:val="0"/>
+        <w:spacing w:after="0" w:line="240" w:lineRule="auto"/>
+        <w:rPr>
+          <w:rFonts w:ascii="Helvetica Neue" w:hAnsi="Helvetica Neue" w:cs="Helvetica Neue"/>
+          <w:color w:val="000000"/>
+          <w:kern w:val="0"/>
+          <w:sz w:val="26"/>
+          <w:szCs w:val="26"/>
+        </w:rPr>
+      </w:pPr>
+    </w:p>
+    <w:p>
+      <w:pPr>
+        <w:tabs>
+          <w:tab w:val="left" w:pos="560"/>
+          <w:tab w:val="left" w:pos="1120"/>
+          <w:tab w:val="left" w:pos="1680"/>
+          <w:tab w:val="left" w:pos="2240"/>
+          <w:tab w:val="left" w:pos="2800"/>
+          <w:tab w:val="left" w:pos="3360"/>
+          <w:tab w:val="left" w:pos="3920"/>
+          <w:tab w:val="left" w:pos="4480"/>
+          <w:tab w:val="left" w:pos="5040"/>
+          <w:tab w:val="left" w:pos="5600"/>
+          <w:tab w:val="left" w:pos="6160"/>
+          <w:tab w:val="left" w:pos="6720"/>
+        </w:tabs>
+        <w:autoSpaceDE w:val="0"/>
+        <w:autoSpaceDN w:val="0"/>
+        <w:adjustRightInd w:val="0"/>
+        <w:spacing w:after="0" w:line="240" w:lineRule="auto"/>
+        <w:rPr>
+          <w:rFonts w:ascii="Helvetica Neue" w:hAnsi="Helvetica Neue" w:cs="Helvetica Neue"/>
+          <w:color w:val="000000"/>
+          <w:kern w:val="0"/>
+          <w:sz w:val="26"/>
+          <w:szCs w:val="26"/>
+        </w:rPr>
+      </w:pPr>
+      <w:r>
+        <w:rPr>
+          <w:rFonts w:ascii="Helvetica Neue" w:hAnsi="Helvetica Neue" w:cs="Helvetica Neue"/>
+          <w:b/>
+          <w:bCs/>
+          <w:color w:val="000000"/>
+          <w:kern w:val="0"/>
+          <w:sz w:val="30"/>
+          <w:szCs w:val="30"/>
+        </w:rPr>
+        <w:t>What was implemented</w:t>
+      </w:r>
+    </w:p>
+    <w:p>
+      <w:pPr>
+        <w:tabs>
+          <w:tab w:val="left" w:pos="560"/>
+          <w:tab w:val="left" w:pos="1120"/>
+          <w:tab w:val="left" w:pos="1680"/>
+          <w:tab w:val="left" w:pos="2240"/>
+          <w:tab w:val="left" w:pos="2800"/>
+          <w:tab w:val="left" w:pos="3360"/>
+          <w:tab w:val="left" w:pos="3920"/>
+          <w:tab w:val="left" w:pos="4480"/>
+          <w:tab w:val="left" w:pos="5040"/>
+          <w:tab w:val="left" w:pos="5600"/>
+          <w:tab w:val="left" w:pos="6160"/>
+          <w:tab w:val="left" w:pos="6720"/>
+        </w:tabs>
+        <w:autoSpaceDE w:val="0"/>
+        <w:autoSpaceDN w:val="0"/>
+        <w:adjustRightInd w:val="0"/>
+        <w:spacing w:after="0" w:line="240" w:lineRule="auto"/>
+        <w:rPr>
+          <w:rFonts w:ascii="Helvetica Neue" w:hAnsi="Helvetica Neue" w:cs="Helvetica Neue"/>
+          <w:color w:val="000000"/>
+          <w:kern w:val="0"/>
+          <w:sz w:val="26"/>
+          <w:szCs w:val="26"/>
+        </w:rPr>
+      </w:pPr>
+    </w:p>
+    <w:p>
+      <w:pPr>
+        <w:tabs>
+          <w:tab w:val="left" w:pos="560"/>
+          <w:tab w:val="left" w:pos="1120"/>
+          <w:tab w:val="left" w:pos="1680"/>
+          <w:tab w:val="left" w:pos="2240"/>
+          <w:tab w:val="left" w:pos="2800"/>
+          <w:tab w:val="left" w:pos="3360"/>
+          <w:tab w:val="left" w:pos="3920"/>
+          <w:tab w:val="left" w:pos="4480"/>
+          <w:tab w:val="left" w:pos="5040"/>
+          <w:tab w:val="left" w:pos="5600"/>
+          <w:tab w:val="left" w:pos="6160"/>
+          <w:tab w:val="left" w:pos="6720"/>
+        </w:tabs>
+        <w:autoSpaceDE w:val="0"/>
+        <w:autoSpaceDN w:val="0"/>
+        <w:adjustRightInd w:val="0"/>
+        <w:spacing w:after="0" w:line="240" w:lineRule="auto"/>
+        <w:rPr>
+          <w:rFonts w:ascii="Helvetica Neue" w:hAnsi="Helvetica Neue" w:cs="Helvetica Neue"/>
+          <w:color w:val="000000"/>
+          <w:kern w:val="0"/>
+          <w:sz w:val="26"/>
+          <w:szCs w:val="26"/>
+        </w:rPr>
+      </w:pPr>
+      <w:r>
+        <w:rPr>
+          <w:rFonts w:ascii="Helvetica Neue" w:hAnsi="Helvetica Neue" w:cs="Helvetica Neue"/>
+          <w:b/>
+          <w:bCs/>
+          <w:color w:val="000000"/>
+          <w:kern w:val="0"/>
+          <w:sz w:val="26"/>
+          <w:szCs w:val="26"/>
+        </w:rPr>
+        <w:t>Formula</w:t>
+      </w:r>
+    </w:p>
+    <w:p>
+      <w:pPr>
+        <w:tabs>
+          <w:tab w:val="left" w:pos="560"/>
+          <w:tab w:val="left" w:pos="1120"/>
+          <w:tab w:val="left" w:pos="1680"/>
+          <w:tab w:val="left" w:pos="2240"/>
+          <w:tab w:val="left" w:pos="2800"/>
+          <w:tab w:val="left" w:pos="3360"/>
+          <w:tab w:val="left" w:pos="3920"/>
+          <w:tab w:val="left" w:pos="4480"/>
+          <w:tab w:val="left" w:pos="5040"/>
+          <w:tab w:val="left" w:pos="5600"/>
+          <w:tab w:val="left" w:pos="6160"/>
+          <w:tab w:val="left" w:pos="6720"/>
+        </w:tabs>
+        <w:autoSpaceDE w:val="0"/>
+        <w:autoSpaceDN w:val="0"/>
+        <w:adjustRightInd w:val="0"/>
+        <w:spacing w:after="0" w:line="240" w:lineRule="auto"/>
+        <w:rPr>
+          <w:rFonts w:ascii="Helvetica Neue" w:hAnsi="Helvetica Neue" w:cs="Helvetica Neue"/>
+          <w:color w:val="000000"/>
+          <w:kern w:val="0"/>
+          <w:sz w:val="26"/>
+          <w:szCs w:val="26"/>
+        </w:rPr>
+      </w:pPr>
+      <w:r>
+        <w:rPr>
+          <w:rFonts w:ascii="Helvetica Neue" w:hAnsi="Helvetica Neue" w:cs="Helvetica Neue"/>
+          <w:color w:val="000000"/>
+          <w:kern w:val="0"/>
+          <w:sz w:val="26"/>
+          <w:szCs w:val="26"/>
+        </w:rPr>
+        <w:t>Gore's Equation 4.5-7 for target plate thickness, validated against the spreadsheet to 4 decimal places (2.7153 mm).</w:t>
+      </w:r>
+    </w:p>
+    <w:p>
+      <w:pPr>
+        <w:tabs>
+          <w:tab w:val="left" w:pos="560"/>
+          <w:tab w:val="left" w:pos="1120"/>
+          <w:tab w:val="left" w:pos="1680"/>
+          <w:tab w:val="left" w:pos="2240"/>
+          <w:tab w:val="left" w:pos="2800"/>
+          <w:tab w:val="left" w:pos="3360"/>
+          <w:tab w:val="left" w:pos="3920"/>
+          <w:tab w:val="left" w:pos="4480"/>
+          <w:tab w:val="left" w:pos="5040"/>
+          <w:tab w:val="left" w:pos="5600"/>
+          <w:tab w:val="left" w:pos="6160"/>
+          <w:tab w:val="left" w:pos="6720"/>
+        </w:tabs>
+        <w:autoSpaceDE w:val="0"/>
+        <w:autoSpaceDN w:val="0"/>
+        <w:adjustRightInd w:val="0"/>
+        <w:spacing w:after="0" w:line="240" w:lineRule="auto"/>
+        <w:rPr>
+          <w:rFonts w:ascii="Helvetica Neue" w:hAnsi="Helvetica Neue" w:cs="Helvetica Neue"/>
+          <w:color w:val="000000"/>
+          <w:kern w:val="0"/>
+          <w:sz w:val="26"/>
+          <w:szCs w:val="26"/>
+        </w:rPr>
+      </w:pPr>
+    </w:p>
+    <w:p>
+      <w:pPr>
+        <w:tabs>
+          <w:tab w:val="left" w:pos="560"/>
+          <w:tab w:val="left" w:pos="1120"/>
+          <w:tab w:val="left" w:pos="1680"/>
+          <w:tab w:val="left" w:pos="2240"/>
+          <w:tab w:val="left" w:pos="2800"/>
+          <w:tab w:val="left" w:pos="3360"/>
+          <w:tab w:val="left" w:pos="3920"/>
+          <w:tab w:val="left" w:pos="4480"/>
+          <w:tab w:val="left" w:pos="5040"/>
+          <w:tab w:val="left" w:pos="5600"/>
+          <w:tab w:val="left" w:pos="6160"/>
+          <w:tab w:val="left" w:pos="6720"/>
+        </w:tabs>
+        <w:autoSpaceDE w:val="0"/>
+        <w:autoSpaceDN w:val="0"/>
+        <w:adjustRightInd w:val="0"/>
+        <w:spacing w:after="0" w:line="240" w:lineRule="auto"/>
+        <w:rPr>
+          <w:rFonts w:ascii="Helvetica Neue" w:hAnsi="Helvetica Neue" w:cs="Helvetica Neue"/>
+          <w:color w:val="000000"/>
+          <w:kern w:val="0"/>
+          <w:sz w:val="26"/>
+          <w:szCs w:val="26"/>
+        </w:rPr>
+      </w:pPr>
+      <w:r>
+        <w:rPr>
+          <w:rFonts w:ascii="System Font" w:hAnsi="System Font" w:cs="System Font"/>
+          <w:b/>
+          <w:bCs/>
+          <w:color w:val="000000"/>
+          <w:kern w:val="0"/>
+          <w:sz w:val="26"/>
+          <w:szCs w:val="26"/>
+        </w:rPr>
+        <w:t>Material​Properties​.swift</w:t>
+      </w:r>
+    </w:p>
+    <w:p>
+      <w:pPr>
+        <w:tabs>
+          <w:tab w:val="left" w:pos="560"/>
+          <w:tab w:val="left" w:pos="1120"/>
+          <w:tab w:val="left" w:pos="1680"/>
+          <w:tab w:val="left" w:pos="2240"/>
+          <w:tab w:val="left" w:pos="2800"/>
+          <w:tab w:val="left" w:pos="3360"/>
+          <w:tab w:val="left" w:pos="3920"/>
+          <w:tab w:val="left" w:pos="4480"/>
+          <w:tab w:val="left" w:pos="5040"/>
+          <w:tab w:val="left" w:pos="5600"/>
+          <w:tab w:val="left" w:pos="6160"/>
+          <w:tab w:val="left" w:pos="6720"/>
+        </w:tabs>
+        <w:autoSpaceDE w:val="0"/>
+        <w:autoSpaceDN w:val="0"/>
+        <w:adjustRightInd w:val="0"/>
+        <w:spacing w:after="0" w:line="240" w:lineRule="auto"/>
+        <w:rPr>
+          <w:rFonts w:ascii="Helvetica Neue" w:hAnsi="Helvetica Neue" w:cs="Helvetica Neue"/>
+          <w:color w:val="000000"/>
+          <w:kern w:val="0"/>
+          <w:sz w:val="26"/>
+          <w:szCs w:val="26"/>
+        </w:rPr>
+      </w:pPr>
+      <w:r>
+        <w:rPr>
+          <w:rFonts w:ascii="Helvetica Neue" w:hAnsi="Helvetica Neue" w:cs="Helvetica Neue"/>
+          <w:color w:val="000000"/>
+          <w:kern w:val="0"/>
+          <w:sz w:val="26"/>
+          <w:szCs w:val="26"/>
+        </w:rPr>
+        <w:lastRenderedPageBreak/>
+        <w:t xml:space="preserve">• Added optional </w:t>
+      </w:r>
+      <w:r>
+        <w:rPr>
+          <w:rFonts w:ascii="System Font" w:hAnsi="System Font" w:cs="System Font"/>
+          <w:color w:val="000000"/>
+          <w:kern w:val="0"/>
+          <w:sz w:val="26"/>
+          <w:szCs w:val="26"/>
+        </w:rPr>
+        <w:t>fundamental​Frequency​Flc: ​Float?</w:t>
+      </w:r>
+      <w:r>
+        <w:rPr>
+          <w:rFonts w:ascii="Helvetica Neue" w:hAnsi="Helvetica Neue" w:cs="Helvetica Neue"/>
+          <w:color w:val="000000"/>
+          <w:kern w:val="0"/>
+          <w:sz w:val="26"/>
+          <w:szCs w:val="26"/>
+        </w:rPr>
+        <w:t xml:space="preserve"> parameter to the struct (backward-compatible, defaults to </w:t>
+      </w:r>
+      <w:r>
+        <w:rPr>
+          <w:rFonts w:ascii="System Font" w:hAnsi="System Font" w:cs="System Font"/>
+          <w:color w:val="000000"/>
+          <w:kern w:val="0"/>
+          <w:sz w:val="26"/>
+          <w:szCs w:val="26"/>
+        </w:rPr>
+        <w:t>nil</w:t>
+      </w:r>
+      <w:r>
+        <w:rPr>
+          <w:rFonts w:ascii="Helvetica Neue" w:hAnsi="Helvetica Neue" w:cs="Helvetica Neue"/>
+          <w:color w:val="000000"/>
+          <w:kern w:val="0"/>
+          <w:sz w:val="26"/>
+          <w:szCs w:val="26"/>
+        </w:rPr>
+        <w:t>)</w:t>
+      </w:r>
+    </w:p>
+    <w:p>
+      <w:pPr>
+        <w:tabs>
+          <w:tab w:val="left" w:pos="560"/>
+          <w:tab w:val="left" w:pos="1120"/>
+          <w:tab w:val="left" w:pos="1680"/>
+          <w:tab w:val="left" w:pos="2240"/>
+          <w:tab w:val="left" w:pos="2800"/>
+          <w:tab w:val="left" w:pos="3360"/>
+          <w:tab w:val="left" w:pos="3920"/>
+          <w:tab w:val="left" w:pos="4480"/>
+          <w:tab w:val="left" w:pos="5040"/>
+          <w:tab w:val="left" w:pos="5600"/>
+          <w:tab w:val="left" w:pos="6160"/>
+          <w:tab w:val="left" w:pos="6720"/>
+        </w:tabs>
+        <w:autoSpaceDE w:val="0"/>
+        <w:autoSpaceDN w:val="0"/>
+        <w:adjustRightInd w:val="0"/>
+        <w:spacing w:after="0" w:line="240" w:lineRule="auto"/>
+        <w:rPr>
+          <w:rFonts w:ascii="Helvetica Neue" w:hAnsi="Helvetica Neue" w:cs="Helvetica Neue"/>
+          <w:color w:val="000000"/>
+          <w:kern w:val="0"/>
+          <w:sz w:val="26"/>
+          <w:szCs w:val="26"/>
+        </w:rPr>
+      </w:pPr>
+      <w:r>
+        <w:rPr>
+          <w:rFonts w:ascii="Helvetica Neue" w:hAnsi="Helvetica Neue" w:cs="Helvetica Neue"/>
+          <w:color w:val="000000"/>
+          <w:kern w:val="0"/>
+          <w:sz w:val="26"/>
+          <w:szCs w:val="26"/>
+        </w:rPr>
+        <w:t>• Added 4 private Gore coefficients derived from the fixed Poisson's ratios (vcl=0.05, vlcVcl=0.02)</w:t>
+      </w:r>
+    </w:p>
+    <w:p>
+      <w:pPr>
+        <w:tabs>
+          <w:tab w:val="left" w:pos="560"/>
+          <w:tab w:val="left" w:pos="1120"/>
+          <w:tab w:val="left" w:pos="1680"/>
+          <w:tab w:val="left" w:pos="2240"/>
+          <w:tab w:val="left" w:pos="2800"/>
+          <w:tab w:val="left" w:pos="3360"/>
+          <w:tab w:val="left" w:pos="3920"/>
+          <w:tab w:val="left" w:pos="4480"/>
+          <w:tab w:val="left" w:pos="5040"/>
+          <w:tab w:val="left" w:pos="5600"/>
+          <w:tab w:val="left" w:pos="6160"/>
+          <w:tab w:val="left" w:pos="6720"/>
+        </w:tabs>
+        <w:autoSpaceDE w:val="0"/>
+        <w:autoSpaceDN w:val="0"/>
+        <w:adjustRightInd w:val="0"/>
+        <w:spacing w:after="0" w:line="240" w:lineRule="auto"/>
+        <w:rPr>
+          <w:rFonts w:ascii="Helvetica Neue" w:hAnsi="Helvetica Neue" w:cs="Helvetica Neue"/>
+          <w:color w:val="000000"/>
+          <w:kern w:val="0"/>
+          <w:sz w:val="26"/>
+          <w:szCs w:val="26"/>
+        </w:rPr>
+      </w:pPr>
+      <w:r>
+        <w:rPr>
+          <w:rFonts w:ascii="Helvetica Neue" w:hAnsi="Helvetica Neue" w:cs="Helvetica Neue"/>
+          <w:color w:val="000000"/>
+          <w:kern w:val="0"/>
+          <w:sz w:val="26"/>
+          <w:szCs w:val="26"/>
+        </w:rPr>
+        <w:t xml:space="preserve">• </w:t>
+      </w:r>
+      <w:r>
+        <w:rPr>
+          <w:rFonts w:ascii="System Font" w:hAnsi="System Font" w:cs="System Font"/>
+          <w:color w:val="000000"/>
+          <w:kern w:val="0"/>
+          <w:sz w:val="26"/>
+          <w:szCs w:val="26"/>
+        </w:rPr>
+        <w:t>gore​Youngs​Modulus​Long</w:t>
+      </w:r>
+      <w:r>
+        <w:rPr>
+          <w:rFonts w:ascii="Helvetica Neue" w:hAnsi="Helvetica Neue" w:cs="Helvetica Neue"/>
+          <w:color w:val="000000"/>
+          <w:kern w:val="0"/>
+          <w:sz w:val="26"/>
+          <w:szCs w:val="26"/>
+        </w:rPr>
+        <w:t xml:space="preserve"> / </w:t>
+      </w:r>
+      <w:r>
+        <w:rPr>
+          <w:rFonts w:ascii="System Font" w:hAnsi="System Font" w:cs="System Font"/>
+          <w:color w:val="000000"/>
+          <w:kern w:val="0"/>
+          <w:sz w:val="26"/>
+          <w:szCs w:val="26"/>
+        </w:rPr>
+        <w:t>gore​Youngs​Modulus​Cross</w:t>
+      </w:r>
+      <w:r>
+        <w:rPr>
+          <w:rFonts w:ascii="Helvetica Neue" w:hAnsi="Helvetica Neue" w:cs="Helvetica Neue"/>
+          <w:color w:val="000000"/>
+          <w:kern w:val="0"/>
+          <w:sz w:val="26"/>
+          <w:szCs w:val="26"/>
+        </w:rPr>
+        <w:t xml:space="preserve"> — Gore's plate formula for EL and EC (slightly more accurate than the existing beam formula)</w:t>
+      </w:r>
+    </w:p>
+    <w:p>
+      <w:pPr>
+        <w:tabs>
+          <w:tab w:val="left" w:pos="560"/>
+          <w:tab w:val="left" w:pos="1120"/>
+          <w:tab w:val="left" w:pos="1680"/>
+          <w:tab w:val="left" w:pos="2240"/>
+          <w:tab w:val="left" w:pos="2800"/>
+          <w:tab w:val="left" w:pos="3360"/>
+          <w:tab w:val="left" w:pos="3920"/>
+          <w:tab w:val="left" w:pos="4480"/>
+          <w:tab w:val="left" w:pos="5040"/>
+          <w:tab w:val="left" w:pos="5600"/>
+          <w:tab w:val="left" w:pos="6160"/>
+          <w:tab w:val="left" w:pos="6720"/>
+        </w:tabs>
+        <w:autoSpaceDE w:val="0"/>
+        <w:autoSpaceDN w:val="0"/>
+        <w:adjustRightInd w:val="0"/>
+        <w:spacing w:after="0" w:line="240" w:lineRule="auto"/>
+        <w:rPr>
+          <w:rFonts w:ascii="Helvetica Neue" w:hAnsi="Helvetica Neue" w:cs="Helvetica Neue"/>
+          <w:color w:val="000000"/>
+          <w:kern w:val="0"/>
+          <w:sz w:val="26"/>
+          <w:szCs w:val="26"/>
+        </w:rPr>
+      </w:pPr>
+      <w:r>
+        <w:rPr>
+          <w:rFonts w:ascii="Helvetica Neue" w:hAnsi="Helvetica Neue" w:cs="Helvetica Neue"/>
+          <w:color w:val="000000"/>
+          <w:kern w:val="0"/>
+          <w:sz w:val="26"/>
+          <w:szCs w:val="26"/>
+        </w:rPr>
+        <w:t xml:space="preserve">• </w:t>
+      </w:r>
+      <w:r>
+        <w:rPr>
+          <w:rFonts w:ascii="System Font" w:hAnsi="System Font" w:cs="System Font"/>
+          <w:color w:val="000000"/>
+          <w:kern w:val="0"/>
+          <w:sz w:val="26"/>
+          <w:szCs w:val="26"/>
+        </w:rPr>
+        <w:t>gore​Shear​Modulus: ​Float?</w:t>
+      </w:r>
+      <w:r>
+        <w:rPr>
+          <w:rFonts w:ascii="Helvetica Neue" w:hAnsi="Helvetica Neue" w:cs="Helvetica Neue"/>
+          <w:color w:val="000000"/>
+          <w:kern w:val="0"/>
+          <w:sz w:val="26"/>
+          <w:szCs w:val="26"/>
+        </w:rPr>
+        <w:t xml:space="preserve"> — GLC from the FLC tap frequency; </w:t>
+      </w:r>
+      <w:r>
+        <w:rPr>
+          <w:rFonts w:ascii="System Font" w:hAnsi="System Font" w:cs="System Font"/>
+          <w:color w:val="000000"/>
+          <w:kern w:val="0"/>
+          <w:sz w:val="26"/>
+          <w:szCs w:val="26"/>
+        </w:rPr>
+        <w:t>nil</w:t>
+      </w:r>
+      <w:r>
+        <w:rPr>
+          <w:rFonts w:ascii="Helvetica Neue" w:hAnsi="Helvetica Neue" w:cs="Helvetica Neue"/>
+          <w:color w:val="000000"/>
+          <w:kern w:val="0"/>
+          <w:sz w:val="26"/>
+          <w:szCs w:val="26"/>
+        </w:rPr>
+        <w:t xml:space="preserve"> if no FLC</w:t>
+      </w:r>
+    </w:p>
+    <w:p>
+      <w:pPr>
+        <w:tabs>
+          <w:tab w:val="left" w:pos="560"/>
+          <w:tab w:val="left" w:pos="1120"/>
+          <w:tab w:val="left" w:pos="1680"/>
+          <w:tab w:val="left" w:pos="2240"/>
+          <w:tab w:val="left" w:pos="2800"/>
+          <w:tab w:val="left" w:pos="3360"/>
+          <w:tab w:val="left" w:pos="3920"/>
+          <w:tab w:val="left" w:pos="4480"/>
+          <w:tab w:val="left" w:pos="5040"/>
+          <w:tab w:val="left" w:pos="5600"/>
+          <w:tab w:val="left" w:pos="6160"/>
+          <w:tab w:val="left" w:pos="6720"/>
+        </w:tabs>
+        <w:autoSpaceDE w:val="0"/>
+        <w:autoSpaceDN w:val="0"/>
+        <w:adjustRightInd w:val="0"/>
+        <w:spacing w:after="0" w:line="240" w:lineRule="auto"/>
+        <w:rPr>
+          <w:rFonts w:ascii="Helvetica Neue" w:hAnsi="Helvetica Neue" w:cs="Helvetica Neue"/>
+          <w:color w:val="000000"/>
+          <w:kern w:val="0"/>
+          <w:sz w:val="26"/>
+          <w:szCs w:val="26"/>
+        </w:rPr>
+      </w:pPr>
+      <w:r>
+        <w:rPr>
+          <w:rFonts w:ascii="Helvetica Neue" w:hAnsi="Helvetica Neue" w:cs="Helvetica Neue"/>
+          <w:color w:val="000000"/>
+          <w:kern w:val="0"/>
+          <w:sz w:val="26"/>
+          <w:szCs w:val="26"/>
+        </w:rPr>
+        <w:t xml:space="preserve">• </w:t>
+      </w:r>
+      <w:r>
+        <w:rPr>
+          <w:rFonts w:ascii="System Font" w:hAnsi="System Font" w:cs="System Font"/>
+          <w:color w:val="000000"/>
+          <w:kern w:val="0"/>
+          <w:sz w:val="26"/>
+          <w:szCs w:val="26"/>
+        </w:rPr>
+        <w:t>gore​Target​Thickness(body​Length​Mm​:body​Width​Mm​:vibrational​Stiffness:) -&gt; ​Float?</w:t>
+      </w:r>
+      <w:r>
+        <w:rPr>
+          <w:rFonts w:ascii="Helvetica Neue" w:hAnsi="Helvetica Neue" w:cs="Helvetica Neue"/>
+          <w:color w:val="000000"/>
+          <w:kern w:val="0"/>
+          <w:sz w:val="26"/>
+          <w:szCs w:val="26"/>
+        </w:rPr>
+        <w:t xml:space="preserve"> — the full Gore Eq. 4.5-7</w:t>
+      </w:r>
+    </w:p>
+    <w:p>
+      <w:pPr>
+        <w:tabs>
+          <w:tab w:val="left" w:pos="560"/>
+          <w:tab w:val="left" w:pos="1120"/>
+          <w:tab w:val="left" w:pos="1680"/>
+          <w:tab w:val="left" w:pos="2240"/>
+          <w:tab w:val="left" w:pos="2800"/>
+          <w:tab w:val="left" w:pos="3360"/>
+          <w:tab w:val="left" w:pos="3920"/>
+          <w:tab w:val="left" w:pos="4480"/>
+          <w:tab w:val="left" w:pos="5040"/>
+          <w:tab w:val="left" w:pos="5600"/>
+          <w:tab w:val="left" w:pos="6160"/>
+          <w:tab w:val="left" w:pos="6720"/>
+        </w:tabs>
+        <w:autoSpaceDE w:val="0"/>
+        <w:autoSpaceDN w:val="0"/>
+        <w:adjustRightInd w:val="0"/>
+        <w:spacing w:after="0" w:line="240" w:lineRule="auto"/>
+        <w:rPr>
+          <w:rFonts w:ascii="Helvetica Neue" w:hAnsi="Helvetica Neue" w:cs="Helvetica Neue"/>
+          <w:color w:val="000000"/>
+          <w:kern w:val="0"/>
+          <w:sz w:val="26"/>
+          <w:szCs w:val="26"/>
+        </w:rPr>
+      </w:pPr>
+    </w:p>
+    <w:p>
+      <w:pPr>
+        <w:tabs>
+          <w:tab w:val="left" w:pos="560"/>
+          <w:tab w:val="left" w:pos="1120"/>
+          <w:tab w:val="left" w:pos="1680"/>
+          <w:tab w:val="left" w:pos="2240"/>
+          <w:tab w:val="left" w:pos="2800"/>
+          <w:tab w:val="left" w:pos="3360"/>
+          <w:tab w:val="left" w:pos="3920"/>
+          <w:tab w:val="left" w:pos="4480"/>
+          <w:tab w:val="left" w:pos="5040"/>
+          <w:tab w:val="left" w:pos="5600"/>
+          <w:tab w:val="left" w:pos="6160"/>
+          <w:tab w:val="left" w:pos="6720"/>
+        </w:tabs>
+        <w:autoSpaceDE w:val="0"/>
+        <w:autoSpaceDN w:val="0"/>
+        <w:adjustRightInd w:val="0"/>
+        <w:spacing w:after="0" w:line="240" w:lineRule="auto"/>
+        <w:rPr>
+          <w:rFonts w:ascii="Helvetica Neue" w:hAnsi="Helvetica Neue" w:cs="Helvetica Neue"/>
+          <w:color w:val="000000"/>
+          <w:kern w:val="0"/>
+          <w:sz w:val="26"/>
+          <w:szCs w:val="26"/>
+        </w:rPr>
+      </w:pPr>
+      <w:r>
+        <w:rPr>
+          <w:rFonts w:ascii="System Font" w:hAnsi="System Font" w:cs="System Font"/>
+          <w:b/>
+          <w:bCs/>
+          <w:color w:val="000000"/>
+          <w:kern w:val="0"/>
+          <w:sz w:val="26"/>
+          <w:szCs w:val="26"/>
+        </w:rPr>
+        <w:t>Spectrum​Display​Settings​.swift</w:t>
+      </w:r>
+    </w:p>
+    <w:p>
+      <w:pPr>
+        <w:tabs>
+          <w:tab w:val="left" w:pos="560"/>
+          <w:tab w:val="left" w:pos="1120"/>
+          <w:tab w:val="left" w:pos="1680"/>
+          <w:tab w:val="left" w:pos="2240"/>
+          <w:tab w:val="left" w:pos="2800"/>
+          <w:tab w:val="left" w:pos="3360"/>
+          <w:tab w:val="left" w:pos="3920"/>
+          <w:tab w:val="left" w:pos="4480"/>
+          <w:tab w:val="left" w:pos="5040"/>
+          <w:tab w:val="left" w:pos="5600"/>
+          <w:tab w:val="left" w:pos="6160"/>
+          <w:tab w:val="left" w:pos="6720"/>
+        </w:tabs>
+        <w:autoSpaceDE w:val="0"/>
+        <w:autoSpaceDN w:val="0"/>
+        <w:adjustRightInd w:val="0"/>
+        <w:spacing w:after="0" w:line="240" w:lineRule="auto"/>
+        <w:rPr>
+          <w:rFonts w:ascii="Helvetica Neue" w:hAnsi="Helvetica Neue" w:cs="Helvetica Neue"/>
+          <w:color w:val="000000"/>
+          <w:kern w:val="0"/>
+          <w:sz w:val="26"/>
+          <w:szCs w:val="26"/>
+        </w:rPr>
+      </w:pPr>
+      <w:r>
+        <w:rPr>
+          <w:rFonts w:ascii="Helvetica Neue" w:hAnsi="Helvetica Neue" w:cs="Helvetica Neue"/>
+          <w:color w:val="000000"/>
+          <w:kern w:val="0"/>
+          <w:sz w:val="26"/>
+          <w:szCs w:val="26"/>
+        </w:rPr>
+        <w:t xml:space="preserve">• New </w:t>
+      </w:r>
+      <w:r>
+        <w:rPr>
+          <w:rFonts w:ascii="System Font" w:hAnsi="System Font" w:cs="System Font"/>
+          <w:color w:val="000000"/>
+          <w:kern w:val="0"/>
+          <w:sz w:val="26"/>
+          <w:szCs w:val="26"/>
+        </w:rPr>
+        <w:t>Plate​Stiffness​Preset</w:t>
+      </w:r>
+      <w:r>
+        <w:rPr>
+          <w:rFonts w:ascii="Helvetica Neue" w:hAnsi="Helvetica Neue" w:cs="Helvetica Neue"/>
+          <w:color w:val="000000"/>
+          <w:kern w:val="0"/>
+          <w:sz w:val="26"/>
+          <w:szCs w:val="26"/>
+        </w:rPr>
+        <w:t xml:space="preserve"> enum (Steel String Top=75, SS Back=55, Classical Top=50, Classical Back=50, Custom)</w:t>
+      </w:r>
+    </w:p>
+    <w:p>
+      <w:pPr>
+        <w:tabs>
+          <w:tab w:val="left" w:pos="560"/>
+          <w:tab w:val="left" w:pos="1120"/>
+          <w:tab w:val="left" w:pos="1680"/>
+          <w:tab w:val="left" w:pos="2240"/>
+          <w:tab w:val="left" w:pos="2800"/>
+          <w:tab w:val="left" w:pos="3360"/>
+          <w:tab w:val="left" w:pos="3920"/>
+          <w:tab w:val="left" w:pos="4480"/>
+          <w:tab w:val="left" w:pos="5040"/>
+          <w:tab w:val="left" w:pos="5600"/>
+          <w:tab w:val="left" w:pos="6160"/>
+          <w:tab w:val="left" w:pos="6720"/>
+        </w:tabs>
+        <w:autoSpaceDE w:val="0"/>
+        <w:autoSpaceDN w:val="0"/>
+        <w:adjustRightInd w:val="0"/>
+        <w:spacing w:after="0" w:line="240" w:lineRule="auto"/>
+        <w:rPr>
+          <w:rFonts w:ascii="Helvetica Neue" w:hAnsi="Helvetica Neue" w:cs="Helvetica Neue"/>
+          <w:color w:val="000000"/>
+          <w:kern w:val="0"/>
+          <w:sz w:val="26"/>
+          <w:szCs w:val="26"/>
+        </w:rPr>
+      </w:pPr>
+      <w:r>
+        <w:rPr>
+          <w:rFonts w:ascii="Helvetica Neue" w:hAnsi="Helvetica Neue" w:cs="Helvetica Neue"/>
+          <w:color w:val="000000"/>
+          <w:kern w:val="0"/>
+          <w:sz w:val="26"/>
+          <w:szCs w:val="26"/>
+        </w:rPr>
+        <w:t xml:space="preserve">• New persisted settings: </w:t>
+      </w:r>
+      <w:r>
+        <w:rPr>
+          <w:rFonts w:ascii="System Font" w:hAnsi="System Font" w:cs="System Font"/>
+          <w:color w:val="000000"/>
+          <w:kern w:val="0"/>
+          <w:sz w:val="26"/>
+          <w:szCs w:val="26"/>
+        </w:rPr>
+        <w:t>guitar​Body​Length</w:t>
+      </w:r>
+      <w:r>
+        <w:rPr>
+          <w:rFonts w:ascii="Helvetica Neue" w:hAnsi="Helvetica Neue" w:cs="Helvetica Neue"/>
+          <w:color w:val="000000"/>
+          <w:kern w:val="0"/>
+          <w:sz w:val="26"/>
+          <w:szCs w:val="26"/>
+        </w:rPr>
+        <w:t xml:space="preserve"> (490mm default), </w:t>
+      </w:r>
+      <w:r>
+        <w:rPr>
+          <w:rFonts w:ascii="System Font" w:hAnsi="System Font" w:cs="System Font"/>
+          <w:color w:val="000000"/>
+          <w:kern w:val="0"/>
+          <w:sz w:val="26"/>
+          <w:szCs w:val="26"/>
+        </w:rPr>
+        <w:t>guitar​Body​Width</w:t>
+      </w:r>
+      <w:r>
+        <w:rPr>
+          <w:rFonts w:ascii="Helvetica Neue" w:hAnsi="Helvetica Neue" w:cs="Helvetica Neue"/>
+          <w:color w:val="000000"/>
+          <w:kern w:val="0"/>
+          <w:sz w:val="26"/>
+          <w:szCs w:val="26"/>
+        </w:rPr>
+        <w:t xml:space="preserve"> (390mm default), </w:t>
+      </w:r>
+      <w:r>
+        <w:rPr>
+          <w:rFonts w:ascii="System Font" w:hAnsi="System Font" w:cs="System Font"/>
+          <w:color w:val="000000"/>
+          <w:kern w:val="0"/>
+          <w:sz w:val="26"/>
+          <w:szCs w:val="26"/>
+        </w:rPr>
+        <w:t>plate​Stiffness​Preset</w:t>
+      </w:r>
+      <w:r>
+        <w:rPr>
+          <w:rFonts w:ascii="Helvetica Neue" w:hAnsi="Helvetica Neue" w:cs="Helvetica Neue"/>
+          <w:color w:val="000000"/>
+          <w:kern w:val="0"/>
+          <w:sz w:val="26"/>
+          <w:szCs w:val="26"/>
+        </w:rPr>
+        <w:t xml:space="preserve">, </w:t>
+      </w:r>
+      <w:r>
+        <w:rPr>
+          <w:rFonts w:ascii="System Font" w:hAnsi="System Font" w:cs="System Font"/>
+          <w:color w:val="000000"/>
+          <w:kern w:val="0"/>
+          <w:sz w:val="26"/>
+          <w:szCs w:val="26"/>
+        </w:rPr>
+        <w:t>custom​Plate​Stiffness</w:t>
+      </w:r>
+      <w:r>
+        <w:rPr>
+          <w:rFonts w:ascii="Helvetica Neue" w:hAnsi="Helvetica Neue" w:cs="Helvetica Neue"/>
+          <w:color w:val="000000"/>
+          <w:kern w:val="0"/>
+          <w:sz w:val="26"/>
+          <w:szCs w:val="26"/>
+        </w:rPr>
+        <w:t xml:space="preserve">, and the computed </w:t>
+      </w:r>
+      <w:r>
+        <w:rPr>
+          <w:rFonts w:ascii="System Font" w:hAnsi="System Font" w:cs="System Font"/>
+          <w:color w:val="000000"/>
+          <w:kern w:val="0"/>
+          <w:sz w:val="26"/>
+          <w:szCs w:val="26"/>
+        </w:rPr>
+        <w:t>plate​Stiffness</w:t>
+      </w:r>
+    </w:p>
+    <w:p>
+      <w:pPr>
+        <w:tabs>
+          <w:tab w:val="left" w:pos="560"/>
+          <w:tab w:val="left" w:pos="1120"/>
+          <w:tab w:val="left" w:pos="1680"/>
+          <w:tab w:val="left" w:pos="2240"/>
+          <w:tab w:val="left" w:pos="2800"/>
+          <w:tab w:val="left" w:pos="3360"/>
+          <w:tab w:val="left" w:pos="3920"/>
+          <w:tab w:val="left" w:pos="4480"/>
+          <w:tab w:val="left" w:pos="5040"/>
+          <w:tab w:val="left" w:pos="5600"/>
+          <w:tab w:val="left" w:pos="6160"/>
+          <w:tab w:val="left" w:pos="6720"/>
+        </w:tabs>
+        <w:autoSpaceDE w:val="0"/>
+        <w:autoSpaceDN w:val="0"/>
+        <w:adjustRightInd w:val="0"/>
+        <w:spacing w:after="0" w:line="240" w:lineRule="auto"/>
+        <w:rPr>
+          <w:rFonts w:ascii="Helvetica Neue" w:hAnsi="Helvetica Neue" w:cs="Helvetica Neue"/>
+          <w:color w:val="000000"/>
+          <w:kern w:val="0"/>
+          <w:sz w:val="26"/>
+          <w:szCs w:val="26"/>
+        </w:rPr>
+      </w:pPr>
+    </w:p>
+    <w:p>
+      <w:pPr>
+        <w:tabs>
+          <w:tab w:val="left" w:pos="560"/>
+          <w:tab w:val="left" w:pos="1120"/>
+          <w:tab w:val="left" w:pos="1680"/>
+          <w:tab w:val="left" w:pos="2240"/>
+          <w:tab w:val="left" w:pos="2800"/>
+          <w:tab w:val="left" w:pos="3360"/>
+          <w:tab w:val="left" w:pos="3920"/>
+          <w:tab w:val="left" w:pos="4480"/>
+          <w:tab w:val="left" w:pos="5040"/>
+          <w:tab w:val="left" w:pos="5600"/>
+          <w:tab w:val="left" w:pos="6160"/>
+          <w:tab w:val="left" w:pos="6720"/>
+        </w:tabs>
+        <w:autoSpaceDE w:val="0"/>
+        <w:autoSpaceDN w:val="0"/>
+        <w:adjustRightInd w:val="0"/>
+        <w:spacing w:after="0" w:line="240" w:lineRule="auto"/>
+        <w:rPr>
+          <w:rFonts w:ascii="Helvetica Neue" w:hAnsi="Helvetica Neue" w:cs="Helvetica Neue"/>
+          <w:color w:val="000000"/>
+          <w:kern w:val="0"/>
+          <w:sz w:val="26"/>
+          <w:szCs w:val="26"/>
+        </w:rPr>
+      </w:pPr>
+      <w:r>
+        <w:rPr>
+          <w:rFonts w:ascii="System Font" w:hAnsi="System Font" w:cs="System Font"/>
+          <w:b/>
+          <w:bCs/>
+          <w:color w:val="000000"/>
+          <w:kern w:val="0"/>
+          <w:sz w:val="26"/>
+          <w:szCs w:val="26"/>
+        </w:rPr>
+        <w:t>Spectrum​Settings​View​.swift</w:t>
+      </w:r>
+    </w:p>
+    <w:p>
+      <w:pPr>
+        <w:tabs>
+          <w:tab w:val="left" w:pos="560"/>
+          <w:tab w:val="left" w:pos="1120"/>
+          <w:tab w:val="left" w:pos="1680"/>
+          <w:tab w:val="left" w:pos="2240"/>
+          <w:tab w:val="left" w:pos="2800"/>
+          <w:tab w:val="left" w:pos="3360"/>
+          <w:tab w:val="left" w:pos="3920"/>
+          <w:tab w:val="left" w:pos="4480"/>
+          <w:tab w:val="left" w:pos="5040"/>
+          <w:tab w:val="left" w:pos="5600"/>
+          <w:tab w:val="left" w:pos="6160"/>
+          <w:tab w:val="left" w:pos="6720"/>
+        </w:tabs>
+        <w:autoSpaceDE w:val="0"/>
+        <w:autoSpaceDN w:val="0"/>
+        <w:adjustRightInd w:val="0"/>
+        <w:spacing w:after="0" w:line="240" w:lineRule="auto"/>
+        <w:rPr>
+          <w:rFonts w:ascii="Helvetica Neue" w:hAnsi="Helvetica Neue" w:cs="Helvetica Neue"/>
+          <w:color w:val="000000"/>
+          <w:kern w:val="0"/>
+          <w:sz w:val="26"/>
+          <w:szCs w:val="26"/>
+        </w:rPr>
+      </w:pPr>
+      <w:r>
+        <w:rPr>
+          <w:rFonts w:ascii="Helvetica Neue" w:hAnsi="Helvetica Neue" w:cs="Helvetica Neue"/>
+          <w:color w:val="000000"/>
+          <w:kern w:val="0"/>
+          <w:sz w:val="26"/>
+          <w:szCs w:val="26"/>
+        </w:rPr>
+        <w:t>• New fields in the Material settings section: Body Length (a), Lower Bout Width (b), a preset picker for plate vibrational stiffness, and a custom value field that appears when Custom is selected</w:t>
+      </w:r>
+    </w:p>
+    <w:p>
+      <w:pPr>
+        <w:tabs>
+          <w:tab w:val="left" w:pos="560"/>
+          <w:tab w:val="left" w:pos="1120"/>
+          <w:tab w:val="left" w:pos="1680"/>
+          <w:tab w:val="left" w:pos="2240"/>
+          <w:tab w:val="left" w:pos="2800"/>
+          <w:tab w:val="left" w:pos="3360"/>
+          <w:tab w:val="left" w:pos="3920"/>
+          <w:tab w:val="left" w:pos="4480"/>
+          <w:tab w:val="left" w:pos="5040"/>
+          <w:tab w:val="left" w:pos="5600"/>
+          <w:tab w:val="left" w:pos="6160"/>
+          <w:tab w:val="left" w:pos="6720"/>
+        </w:tabs>
+        <w:autoSpaceDE w:val="0"/>
+        <w:autoSpaceDN w:val="0"/>
+        <w:adjustRightInd w:val="0"/>
+        <w:spacing w:after="0" w:line="240" w:lineRule="auto"/>
+        <w:rPr>
+          <w:rFonts w:ascii="Helvetica Neue" w:hAnsi="Helvetica Neue" w:cs="Helvetica Neue"/>
+          <w:color w:val="000000"/>
+          <w:kern w:val="0"/>
+          <w:sz w:val="26"/>
+          <w:szCs w:val="26"/>
+        </w:rPr>
+      </w:pPr>
+      <w:r>
+        <w:rPr>
+          <w:rFonts w:ascii="Helvetica Neue" w:hAnsi="Helvetica Neue" w:cs="Helvetica Neue"/>
+          <w:color w:val="000000"/>
+          <w:kern w:val="0"/>
+          <w:sz w:val="26"/>
+          <w:szCs w:val="26"/>
+        </w:rPr>
+        <w:t>• All saved on Apply</w:t>
+      </w:r>
+    </w:p>
+    <w:p>
+      <w:pPr>
+        <w:tabs>
+          <w:tab w:val="left" w:pos="560"/>
+          <w:tab w:val="left" w:pos="1120"/>
+          <w:tab w:val="left" w:pos="1680"/>
+          <w:tab w:val="left" w:pos="2240"/>
+          <w:tab w:val="left" w:pos="2800"/>
+          <w:tab w:val="left" w:pos="3360"/>
+          <w:tab w:val="left" w:pos="3920"/>
+          <w:tab w:val="left" w:pos="4480"/>
+          <w:tab w:val="left" w:pos="5040"/>
+          <w:tab w:val="left" w:pos="5600"/>
+          <w:tab w:val="left" w:pos="6160"/>
+          <w:tab w:val="left" w:pos="6720"/>
+        </w:tabs>
+        <w:autoSpaceDE w:val="0"/>
+        <w:autoSpaceDN w:val="0"/>
+        <w:adjustRightInd w:val="0"/>
+        <w:spacing w:after="0" w:line="240" w:lineRule="auto"/>
+        <w:rPr>
+          <w:rFonts w:ascii="Helvetica Neue" w:hAnsi="Helvetica Neue" w:cs="Helvetica Neue"/>
+          <w:color w:val="000000"/>
+          <w:kern w:val="0"/>
+          <w:sz w:val="26"/>
+          <w:szCs w:val="26"/>
+        </w:rPr>
+      </w:pPr>
+    </w:p>
+    <w:p>
+      <w:pPr>
+        <w:tabs>
+          <w:tab w:val="left" w:pos="560"/>
+          <w:tab w:val="left" w:pos="1120"/>
+          <w:tab w:val="left" w:pos="1680"/>
+          <w:tab w:val="left" w:pos="2240"/>
+          <w:tab w:val="left" w:pos="2800"/>
+          <w:tab w:val="left" w:pos="3360"/>
+          <w:tab w:val="left" w:pos="3920"/>
+          <w:tab w:val="left" w:pos="4480"/>
+          <w:tab w:val="left" w:pos="5040"/>
+          <w:tab w:val="left" w:pos="5600"/>
+          <w:tab w:val="left" w:pos="6160"/>
+          <w:tab w:val="left" w:pos="6720"/>
+        </w:tabs>
+        <w:autoSpaceDE w:val="0"/>
+        <w:autoSpaceDN w:val="0"/>
+        <w:adjustRightInd w:val="0"/>
+        <w:spacing w:after="0" w:line="240" w:lineRule="auto"/>
+        <w:rPr>
+          <w:rFonts w:ascii="Helvetica Neue" w:hAnsi="Helvetica Neue" w:cs="Helvetica Neue"/>
+          <w:color w:val="000000"/>
+          <w:kern w:val="0"/>
+          <w:sz w:val="26"/>
+          <w:szCs w:val="26"/>
+        </w:rPr>
+      </w:pPr>
+      <w:r>
+        <w:rPr>
+          <w:rFonts w:ascii="System Font" w:hAnsi="System Font" w:cs="System Font"/>
+          <w:b/>
+          <w:bCs/>
+          <w:color w:val="000000"/>
+          <w:kern w:val="0"/>
+          <w:sz w:val="26"/>
+          <w:szCs w:val="26"/>
+        </w:rPr>
+        <w:t>Tap​Analysis​Results​View​.swift</w:t>
+      </w:r>
+    </w:p>
+    <w:p>
+      <w:pPr>
+        <w:tabs>
+          <w:tab w:val="left" w:pos="560"/>
+          <w:tab w:val="left" w:pos="1120"/>
+          <w:tab w:val="left" w:pos="1680"/>
+          <w:tab w:val="left" w:pos="2240"/>
+          <w:tab w:val="left" w:pos="2800"/>
+          <w:tab w:val="left" w:pos="3360"/>
+          <w:tab w:val="left" w:pos="3920"/>
+          <w:tab w:val="left" w:pos="4480"/>
+          <w:tab w:val="left" w:pos="5040"/>
+          <w:tab w:val="left" w:pos="5600"/>
+          <w:tab w:val="left" w:pos="6160"/>
+          <w:tab w:val="left" w:pos="6720"/>
+        </w:tabs>
+        <w:autoSpaceDE w:val="0"/>
+        <w:autoSpaceDN w:val="0"/>
+        <w:adjustRightInd w:val="0"/>
+        <w:spacing w:after="0" w:line="240" w:lineRule="auto"/>
+        <w:rPr>
+          <w:rFonts w:ascii="Helvetica Neue" w:hAnsi="Helvetica Neue" w:cs="Helvetica Neue"/>
+          <w:color w:val="000000"/>
+          <w:kern w:val="0"/>
+          <w:sz w:val="26"/>
+          <w:szCs w:val="26"/>
+        </w:rPr>
+      </w:pPr>
+      <w:r>
+        <w:rPr>
+          <w:rFonts w:ascii="Helvetica Neue" w:hAnsi="Helvetica Neue" w:cs="Helvetica Neue"/>
+          <w:color w:val="000000"/>
+          <w:kern w:val="0"/>
+          <w:sz w:val="26"/>
+          <w:szCs w:val="26"/>
+        </w:rPr>
+        <w:t xml:space="preserve">• </w:t>
+      </w:r>
+      <w:r>
+        <w:rPr>
+          <w:rFonts w:ascii="System Font" w:hAnsi="System Font" w:cs="System Font"/>
+          <w:color w:val="000000"/>
+          <w:kern w:val="0"/>
+          <w:sz w:val="26"/>
+          <w:szCs w:val="26"/>
+        </w:rPr>
+        <w:t>calculated​Material​Properties</w:t>
+      </w:r>
+      <w:r>
+        <w:rPr>
+          <w:rFonts w:ascii="Helvetica Neue" w:hAnsi="Helvetica Neue" w:cs="Helvetica Neue"/>
+          <w:color w:val="000000"/>
+          <w:kern w:val="0"/>
+          <w:sz w:val="26"/>
+          <w:szCs w:val="26"/>
+        </w:rPr>
+        <w:t xml:space="preserve"> now resolves and passes the FLC peak frequency</w:t>
+      </w:r>
+    </w:p>
+    <w:p>
+      <w:r>
+        <w:rPr>
+          <w:rFonts w:ascii="Helvetica Neue" w:hAnsi="Helvetica Neue" w:cs="Helvetica Neue"/>
+          <w:color w:val="000000"/>
+          <w:kern w:val="0"/>
+          <w:sz w:val="26"/>
+          <w:szCs w:val="26"/>
+        </w:rPr>
+        <w:t xml:space="preserve">• New </w:t>
+      </w:r>
+      <w:r>
+        <w:rPr>
+          <w:rFonts w:ascii="System Font" w:hAnsi="System Font" w:cs="System Font"/>
+          <w:color w:val="000000"/>
+          <w:kern w:val="0"/>
+          <w:sz w:val="26"/>
+          <w:szCs w:val="26"/>
+        </w:rPr>
+        <w:t>gore​Thickness​View</w:t>
+      </w:r>
+      <w:r>
+        <w:rPr>
+          <w:rFonts w:ascii="Helvetica Neue" w:hAnsi="Helvetica Neue" w:cs="Helvetica Neue"/>
+          <w:color w:val="000000"/>
+          <w:kern w:val="0"/>
+          <w:sz w:val="26"/>
+          <w:szCs w:val="26"/>
+        </w:rPr>
+        <w:t xml:space="preserve"> shows the target thickness prominently (large number), GLC shear modulus, and the body dimensions/f_vs used. If FLC hasn't been tapped yet, it prompts the user to enable the FLC tap in Settings</w:t>
+      </w:r>
+    </w:p>
     <w:sectPr>
       <w:pgSz w:w="12240" w:h="15840"/>
       <w:pgMar w:top="1440" w:right="1440" w:bottom="1440" w:left="1440" w:header="720" w:footer="720" w:gutter="0"/>

</xml_diff>